<commit_message>
Quitar texto de plantilla y títulos en color; ir directo a las pruebas
- Casos de prueba y reportes de bugs sin ejemplos ni instrucciones de las plantillas
- Títulos y subtítulos en negro/negrita, tablas en gris y negro
- Informe PDF regenerado (42 páginas)

Co-Authored-By: Claude Sonnet 5.5 <noreply@anthropic.com>
Claude-Session: https://claude.ai/code/session_01PFiWp9YGYrfZeQ8YVQNrdy
</commit_message>
<xml_diff>
--- a/bugs/bugs_encontrados.docx
+++ b/bugs/bugs_encontrados.docx
@@ -2,55 +2,6 @@
 <file path=word/document.xml><?xml version="1.0" encoding="utf-8"?>
 <w:document xmlns:mc="http://schemas.openxmlformats.org/markup-compatibility/2006" xmlns:o="urn:schemas-microsoft-com:office:office" xmlns:r="http://schemas.openxmlformats.org/officeDocument/2006/relationships" xmlns:m="http://schemas.openxmlformats.org/officeDocument/2006/math" xmlns:v="urn:schemas-microsoft-com:vml" xmlns:wp="http://schemas.openxmlformats.org/drawingml/2006/wordprocessingDrawing" xmlns:w10="urn:schemas-microsoft-com:office:word" xmlns:w="http://schemas.openxmlformats.org/wordprocessingml/2006/main" xmlns:wne="http://schemas.microsoft.com/office/word/2006/wordml" xmlns:sl="http://schemas.openxmlformats.org/schemaLibrary/2006/main" xmlns:a="http://schemas.openxmlformats.org/drawingml/2006/main" xmlns:pic="http://schemas.openxmlformats.org/drawingml/2006/picture" xmlns:c="http://schemas.openxmlformats.org/drawingml/2006/chart" xmlns:lc="http://schemas.openxmlformats.org/drawingml/2006/lockedCanvas" xmlns:dgm="http://schemas.openxmlformats.org/drawingml/2006/diagram" xmlns:wps="http://schemas.microsoft.com/office/word/2010/wordprocessingShape" xmlns:wpg="http://schemas.microsoft.com/office/word/2010/wordprocessingGroup" xmlns:w14="http://schemas.microsoft.com/office/word/2010/wordml" xmlns:w15="http://schemas.microsoft.com/office/word/2012/wordml" xmlns:w16="http://schemas.microsoft.com/office/word/2018/wordml" xmlns:w16cex="http://schemas.microsoft.com/office/word/2018/wordml/cex" xmlns:w16cid="http://schemas.microsoft.com/office/word/2016/wordml/cid" xmlns="http://schemas.microsoft.com/office/tasks/2019/documenttasks" xmlns:cr="http://schemas.microsoft.com/office/comments/2020/reactions">
   <w:body>
-    <w:p>
-      <w:pPr>
-        <w:pStyle w:val="Heading1"/>
-        <w:keepNext w:val="0"/>
-        <w:keepLines w:val="0"/>
-        <w:pBdr>
-          <w:top w:color="4472c4" w:space="0" w:sz="24" w:val="single"/>
-          <w:left w:color="4472c4" w:space="0" w:sz="24" w:val="single"/>
-          <w:bottom w:color="4472c4" w:space="0" w:sz="24" w:val="single"/>
-          <w:right w:color="4472c4" w:space="0" w:sz="24" w:val="single"/>
-        </w:pBdr>
-        <w:shd w:fill="4472c4" w:val="clear"/>
-        <w:spacing w:after="0" w:before="100" w:lineRule="auto"/>
-        <w:rPr>
-          <w:rFonts w:ascii="Calibri" w:cs="Calibri" w:eastAsia="Calibri" w:hAnsi="Calibri"/>
-          <w:smallCaps w:val="1"/>
-          <w:color w:val="ffffff"/>
-          <w:sz w:val="22"/>
-          <w:szCs w:val="22"/>
-        </w:rPr>
-      </w:pPr>
-      <w:r>
-        <w:rPr>
-          <w:rFonts w:ascii="Calibri" w:cs="Calibri" w:eastAsia="Calibri" w:hAnsi="Calibri"/>
-          <w:smallCaps w:val="1"/>
-          <w:color w:val="ffffff"/>
-          <w:sz w:val="22"/>
-          <w:szCs w:val="22"/>
-          <w:rtl w:val="0"/>
-        </w:rPr>
-        <w:t xml:space="preserve">Bug report template</w:t>
-      </w:r>
-    </w:p>
-    <w:p>
-      <w:pPr>
-        <w:spacing w:after="200" w:before="100" w:lineRule="auto"/>
-        <w:jc w:val="both"/>
-        <w:rPr>
-          <w:rFonts w:ascii="Calibri" w:cs="Calibri" w:eastAsia="Calibri" w:hAnsi="Calibri"/>
-          <w:sz w:val="20"/>
-          <w:szCs w:val="20"/>
-        </w:rPr>
-      </w:pPr>
-      <w:r>
-        <w:rPr>
-          <w:rtl w:val="0"/>
-        </w:rPr>
-      </w:r>
-    </w:p>
     <w:tbl>
       <w:tblPr>
         <w:tblStyle w:val="Table1"/>
@@ -90,12 +41,12 @@
               <w:keepNext w:val="0"/>
               <w:keepLines w:val="0"/>
               <w:pBdr>
-                <w:top w:color="d9e2f3" w:space="0" w:sz="24" w:val="single"/>
-                <w:left w:color="d9e2f3" w:space="0" w:sz="24" w:val="single"/>
-                <w:bottom w:color="d9e2f3" w:space="0" w:sz="24" w:val="single"/>
-                <w:right w:color="d9e2f3" w:space="0" w:sz="24" w:val="single"/>
+                <w:top w:color="D9D9D9" w:space="0" w:sz="24" w:val="single"/>
+                <w:left w:color="D9D9D9" w:space="0" w:sz="24" w:val="single"/>
+                <w:bottom w:color="D9D9D9" w:space="0" w:sz="24" w:val="single"/>
+                <w:right w:color="D9D9D9" w:space="0" w:sz="24" w:val="single"/>
               </w:pBdr>
-              <w:shd w:fill="d9e2f3" w:val="clear"/>
+              <w:shd w:fill="D9D9D9" w:val="clear"/>
               <w:spacing w:after="0" w:before="0" w:lineRule="auto"/>
               <w:rPr>
                 <w:rFonts w:ascii="Calibri" w:cs="Calibri" w:eastAsia="Calibri" w:hAnsi="Calibri"/>
@@ -124,12 +75,12 @@
               <w:keepNext w:val="0"/>
               <w:keepLines w:val="0"/>
               <w:pBdr>
-                <w:top w:color="d9e2f3" w:space="0" w:sz="24" w:val="single"/>
-                <w:left w:color="d9e2f3" w:space="0" w:sz="24" w:val="single"/>
-                <w:bottom w:color="d9e2f3" w:space="0" w:sz="24" w:val="single"/>
-                <w:right w:color="d9e2f3" w:space="0" w:sz="24" w:val="single"/>
+                <w:top w:color="D9D9D9" w:space="0" w:sz="24" w:val="single"/>
+                <w:left w:color="D9D9D9" w:space="0" w:sz="24" w:val="single"/>
+                <w:bottom w:color="D9D9D9" w:space="0" w:sz="24" w:val="single"/>
+                <w:right w:color="D9D9D9" w:space="0" w:sz="24" w:val="single"/>
               </w:pBdr>
-              <w:shd w:fill="d9e2f3" w:val="clear"/>
+              <w:shd w:fill="D9D9D9" w:val="clear"/>
               <w:spacing w:after="0" w:before="0" w:lineRule="auto"/>
               <w:rPr>
                 <w:rFonts w:ascii="Calibri" w:cs="Calibri" w:eastAsia="Calibri" w:hAnsi="Calibri"/>
@@ -997,12 +948,12 @@
               <w:keepNext w:val="0"/>
               <w:keepLines w:val="0"/>
               <w:pBdr>
-                <w:top w:color="d9e2f3" w:space="0" w:sz="24" w:val="single"/>
-                <w:left w:color="d9e2f3" w:space="0" w:sz="24" w:val="single"/>
-                <w:bottom w:color="d9e2f3" w:space="0" w:sz="24" w:val="single"/>
-                <w:right w:color="d9e2f3" w:space="0" w:sz="24" w:val="single"/>
+                <w:top w:color="D9D9D9" w:space="0" w:sz="24" w:val="single"/>
+                <w:left w:color="D9D9D9" w:space="0" w:sz="24" w:val="single"/>
+                <w:bottom w:color="D9D9D9" w:space="0" w:sz="24" w:val="single"/>
+                <w:right w:color="D9D9D9" w:space="0" w:sz="24" w:val="single"/>
               </w:pBdr>
-              <w:shd w:fill="d9e2f3" w:val="clear"/>
+              <w:shd w:fill="D9D9D9" w:val="clear"/>
               <w:spacing w:after="0" w:before="0" w:lineRule="auto"/>
               <w:rPr>
                 <w:rFonts w:ascii="Calibri" w:cs="Calibri" w:eastAsia="Calibri" w:hAnsi="Calibri"/>
@@ -1031,12 +982,12 @@
               <w:keepNext w:val="0"/>
               <w:keepLines w:val="0"/>
               <w:pBdr>
-                <w:top w:color="d9e2f3" w:space="0" w:sz="24" w:val="single"/>
-                <w:left w:color="d9e2f3" w:space="0" w:sz="24" w:val="single"/>
-                <w:bottom w:color="d9e2f3" w:space="0" w:sz="24" w:val="single"/>
-                <w:right w:color="d9e2f3" w:space="0" w:sz="24" w:val="single"/>
+                <w:top w:color="D9D9D9" w:space="0" w:sz="24" w:val="single"/>
+                <w:left w:color="D9D9D9" w:space="0" w:sz="24" w:val="single"/>
+                <w:bottom w:color="D9D9D9" w:space="0" w:sz="24" w:val="single"/>
+                <w:right w:color="D9D9D9" w:space="0" w:sz="24" w:val="single"/>
               </w:pBdr>
-              <w:shd w:fill="d9e2f3" w:val="clear"/>
+              <w:shd w:fill="D9D9D9" w:val="clear"/>
               <w:spacing w:after="0" w:before="0" w:lineRule="auto"/>
               <w:rPr>
                 <w:rFonts w:ascii="Calibri" w:cs="Calibri" w:eastAsia="Calibri" w:hAnsi="Calibri"/>
@@ -1828,12 +1779,12 @@
               <w:keepNext w:val="0"/>
               <w:keepLines w:val="0"/>
               <w:pBdr>
-                <w:top w:color="d9e2f3" w:space="0" w:sz="24" w:val="single"/>
-                <w:left w:color="d9e2f3" w:space="0" w:sz="24" w:val="single"/>
-                <w:bottom w:color="d9e2f3" w:space="0" w:sz="24" w:val="single"/>
-                <w:right w:color="d9e2f3" w:space="0" w:sz="24" w:val="single"/>
+                <w:top w:color="D9D9D9" w:space="0" w:sz="24" w:val="single"/>
+                <w:left w:color="D9D9D9" w:space="0" w:sz="24" w:val="single"/>
+                <w:bottom w:color="D9D9D9" w:space="0" w:sz="24" w:val="single"/>
+                <w:right w:color="D9D9D9" w:space="0" w:sz="24" w:val="single"/>
               </w:pBdr>
-              <w:shd w:fill="d9e2f3" w:val="clear"/>
+              <w:shd w:fill="D9D9D9" w:val="clear"/>
               <w:spacing w:after="0" w:before="0" w:lineRule="auto"/>
               <w:rPr>
                 <w:rFonts w:ascii="Calibri" w:cs="Calibri" w:eastAsia="Calibri" w:hAnsi="Calibri"/>
@@ -1862,12 +1813,12 @@
               <w:keepNext w:val="0"/>
               <w:keepLines w:val="0"/>
               <w:pBdr>
-                <w:top w:color="d9e2f3" w:space="0" w:sz="24" w:val="single"/>
-                <w:left w:color="d9e2f3" w:space="0" w:sz="24" w:val="single"/>
-                <w:bottom w:color="d9e2f3" w:space="0" w:sz="24" w:val="single"/>
-                <w:right w:color="d9e2f3" w:space="0" w:sz="24" w:val="single"/>
+                <w:top w:color="D9D9D9" w:space="0" w:sz="24" w:val="single"/>
+                <w:left w:color="D9D9D9" w:space="0" w:sz="24" w:val="single"/>
+                <w:bottom w:color="D9D9D9" w:space="0" w:sz="24" w:val="single"/>
+                <w:right w:color="D9D9D9" w:space="0" w:sz="24" w:val="single"/>
               </w:pBdr>
-              <w:shd w:fill="d9e2f3" w:val="clear"/>
+              <w:shd w:fill="D9D9D9" w:val="clear"/>
               <w:spacing w:after="0" w:before="0" w:lineRule="auto"/>
               <w:rPr>
                 <w:rFonts w:ascii="Calibri" w:cs="Calibri" w:eastAsia="Calibri" w:hAnsi="Calibri"/>
@@ -2754,12 +2705,12 @@
               <w:keepNext w:val="0"/>
               <w:keepLines w:val="0"/>
               <w:pBdr>
-                <w:top w:color="d9e2f3" w:space="0" w:sz="24" w:val="single"/>
-                <w:left w:color="d9e2f3" w:space="0" w:sz="24" w:val="single"/>
-                <w:bottom w:color="d9e2f3" w:space="0" w:sz="24" w:val="single"/>
-                <w:right w:color="d9e2f3" w:space="0" w:sz="24" w:val="single"/>
+                <w:top w:color="D9D9D9" w:space="0" w:sz="24" w:val="single"/>
+                <w:left w:color="D9D9D9" w:space="0" w:sz="24" w:val="single"/>
+                <w:bottom w:color="D9D9D9" w:space="0" w:sz="24" w:val="single"/>
+                <w:right w:color="D9D9D9" w:space="0" w:sz="24" w:val="single"/>
               </w:pBdr>
-              <w:shd w:fill="d9e2f3" w:val="clear"/>
+              <w:shd w:fill="D9D9D9" w:val="clear"/>
               <w:spacing w:after="0" w:before="0" w:lineRule="auto"/>
               <w:rPr>
                 <w:rFonts w:ascii="Calibri" w:cs="Calibri" w:eastAsia="Calibri" w:hAnsi="Calibri"/>
@@ -2788,12 +2739,12 @@
               <w:keepNext w:val="0"/>
               <w:keepLines w:val="0"/>
               <w:pBdr>
-                <w:top w:color="d9e2f3" w:space="0" w:sz="24" w:val="single"/>
-                <w:left w:color="d9e2f3" w:space="0" w:sz="24" w:val="single"/>
-                <w:bottom w:color="d9e2f3" w:space="0" w:sz="24" w:val="single"/>
-                <w:right w:color="d9e2f3" w:space="0" w:sz="24" w:val="single"/>
+                <w:top w:color="D9D9D9" w:space="0" w:sz="24" w:val="single"/>
+                <w:left w:color="D9D9D9" w:space="0" w:sz="24" w:val="single"/>
+                <w:bottom w:color="D9D9D9" w:space="0" w:sz="24" w:val="single"/>
+                <w:right w:color="D9D9D9" w:space="0" w:sz="24" w:val="single"/>
               </w:pBdr>
-              <w:shd w:fill="d9e2f3" w:val="clear"/>
+              <w:shd w:fill="D9D9D9" w:val="clear"/>
               <w:spacing w:after="0" w:before="0" w:lineRule="auto"/>
               <w:rPr>
                 <w:rFonts w:ascii="Calibri" w:cs="Calibri" w:eastAsia="Calibri" w:hAnsi="Calibri"/>
@@ -3661,12 +3612,12 @@
               <w:keepNext w:val="0"/>
               <w:keepLines w:val="0"/>
               <w:pBdr>
-                <w:top w:color="d9e2f3" w:space="0" w:sz="24" w:val="single"/>
-                <w:left w:color="d9e2f3" w:space="0" w:sz="24" w:val="single"/>
-                <w:bottom w:color="d9e2f3" w:space="0" w:sz="24" w:val="single"/>
-                <w:right w:color="d9e2f3" w:space="0" w:sz="24" w:val="single"/>
+                <w:top w:color="D9D9D9" w:space="0" w:sz="24" w:val="single"/>
+                <w:left w:color="D9D9D9" w:space="0" w:sz="24" w:val="single"/>
+                <w:bottom w:color="D9D9D9" w:space="0" w:sz="24" w:val="single"/>
+                <w:right w:color="D9D9D9" w:space="0" w:sz="24" w:val="single"/>
               </w:pBdr>
-              <w:shd w:fill="d9e2f3" w:val="clear"/>
+              <w:shd w:fill="D9D9D9" w:val="clear"/>
               <w:spacing w:after="0" w:before="0" w:lineRule="auto"/>
               <w:rPr>
                 <w:rFonts w:ascii="Calibri" w:cs="Calibri" w:eastAsia="Calibri" w:hAnsi="Calibri"/>
@@ -3695,12 +3646,12 @@
               <w:keepNext w:val="0"/>
               <w:keepLines w:val="0"/>
               <w:pBdr>
-                <w:top w:color="d9e2f3" w:space="0" w:sz="24" w:val="single"/>
-                <w:left w:color="d9e2f3" w:space="0" w:sz="24" w:val="single"/>
-                <w:bottom w:color="d9e2f3" w:space="0" w:sz="24" w:val="single"/>
-                <w:right w:color="d9e2f3" w:space="0" w:sz="24" w:val="single"/>
+                <w:top w:color="D9D9D9" w:space="0" w:sz="24" w:val="single"/>
+                <w:left w:color="D9D9D9" w:space="0" w:sz="24" w:val="single"/>
+                <w:bottom w:color="D9D9D9" w:space="0" w:sz="24" w:val="single"/>
+                <w:right w:color="D9D9D9" w:space="0" w:sz="24" w:val="single"/>
               </w:pBdr>
-              <w:shd w:fill="d9e2f3" w:val="clear"/>
+              <w:shd w:fill="D9D9D9" w:val="clear"/>
               <w:spacing w:after="0" w:before="0" w:lineRule="auto"/>
               <w:rPr>
                 <w:rFonts w:ascii="Calibri" w:cs="Calibri" w:eastAsia="Calibri" w:hAnsi="Calibri"/>
@@ -4587,12 +4538,12 @@
               <w:keepNext w:val="0"/>
               <w:keepLines w:val="0"/>
               <w:pBdr>
-                <w:top w:color="d9e2f3" w:space="0" w:sz="24" w:val="single"/>
-                <w:left w:color="d9e2f3" w:space="0" w:sz="24" w:val="single"/>
-                <w:bottom w:color="d9e2f3" w:space="0" w:sz="24" w:val="single"/>
-                <w:right w:color="d9e2f3" w:space="0" w:sz="24" w:val="single"/>
+                <w:top w:color="D9D9D9" w:space="0" w:sz="24" w:val="single"/>
+                <w:left w:color="D9D9D9" w:space="0" w:sz="24" w:val="single"/>
+                <w:bottom w:color="D9D9D9" w:space="0" w:sz="24" w:val="single"/>
+                <w:right w:color="D9D9D9" w:space="0" w:sz="24" w:val="single"/>
               </w:pBdr>
-              <w:shd w:fill="d9e2f3" w:val="clear"/>
+              <w:shd w:fill="D9D9D9" w:val="clear"/>
               <w:spacing w:after="0" w:before="0" w:lineRule="auto"/>
               <w:rPr>
                 <w:rFonts w:ascii="Calibri" w:cs="Calibri" w:eastAsia="Calibri" w:hAnsi="Calibri"/>
@@ -4621,12 +4572,12 @@
               <w:keepNext w:val="0"/>
               <w:keepLines w:val="0"/>
               <w:pBdr>
-                <w:top w:color="d9e2f3" w:space="0" w:sz="24" w:val="single"/>
-                <w:left w:color="d9e2f3" w:space="0" w:sz="24" w:val="single"/>
-                <w:bottom w:color="d9e2f3" w:space="0" w:sz="24" w:val="single"/>
-                <w:right w:color="d9e2f3" w:space="0" w:sz="24" w:val="single"/>
+                <w:top w:color="D9D9D9" w:space="0" w:sz="24" w:val="single"/>
+                <w:left w:color="D9D9D9" w:space="0" w:sz="24" w:val="single"/>
+                <w:bottom w:color="D9D9D9" w:space="0" w:sz="24" w:val="single"/>
+                <w:right w:color="D9D9D9" w:space="0" w:sz="24" w:val="single"/>
               </w:pBdr>
-              <w:shd w:fill="d9e2f3" w:val="clear"/>
+              <w:shd w:fill="D9D9D9" w:val="clear"/>
               <w:spacing w:after="0" w:before="0" w:lineRule="auto"/>
               <w:rPr>
                 <w:rFonts w:ascii="Calibri" w:cs="Calibri" w:eastAsia="Calibri" w:hAnsi="Calibri"/>
@@ -5518,96 +5469,7 @@
       </w:rPr>
     </w:r>
     <w:r>
-      <mc:AlternateContent>
-        <mc:Choice Requires="wpg">
-          <w:drawing>
-            <wp:anchor allowOverlap="1" behindDoc="0" distB="0" distT="0" distL="114300" distR="114300" hidden="0" layoutInCell="1" locked="0" relativeHeight="0" simplePos="0">
-              <wp:simplePos x="0" y="0"/>
-              <wp:positionH relativeFrom="column">
-                <wp:posOffset>-50799</wp:posOffset>
-              </wp:positionH>
-              <wp:positionV relativeFrom="paragraph">
-                <wp:posOffset>88900</wp:posOffset>
-              </wp:positionV>
-              <wp:extent cx="6067425" cy="31750"/>
-              <wp:effectExtent b="0" l="0" r="0" t="0"/>
-              <wp:wrapNone/>
-              <wp:docPr id="1952685492" name=""/>
-              <a:graphic>
-                <a:graphicData uri="http://schemas.microsoft.com/office/word/2010/wordprocessingShape">
-                  <wps:wsp>
-                    <wps:cNvCnPr/>
-                    <wps:spPr>
-                      <a:xfrm>
-                        <a:off x="2321813" y="3780000"/>
-                        <a:ext cx="6048375" cy="0"/>
-                      </a:xfrm>
-                      <a:prstGeom prst="straightConnector1">
-                        <a:avLst/>
-                      </a:prstGeom>
-                      <a:noFill/>
-                      <a:ln cap="flat" cmpd="sng" w="9525">
-                        <a:solidFill>
-                          <a:schemeClr val="accent1"/>
-                        </a:solidFill>
-                        <a:prstDash val="solid"/>
-                        <a:miter lim="800000"/>
-                        <a:headEnd len="sm" w="sm" type="none"/>
-                        <a:tailEnd len="sm" w="sm" type="none"/>
-                      </a:ln>
-                    </wps:spPr>
-                    <wps:bodyPr anchorCtr="0" anchor="ctr" bIns="91425" lIns="91425" spcFirstLastPara="1" rIns="91425" wrap="square" tIns="91425">
-                      <a:noAutofit/>
-                    </wps:bodyPr>
-                  </wps:wsp>
-                </a:graphicData>
-              </a:graphic>
-            </wp:anchor>
-          </w:drawing>
-        </mc:Choice>
-        <mc:Fallback>
-          <w:drawing>
-            <wp:anchor allowOverlap="1" behindDoc="0" distB="0" distT="0" distL="114300" distR="114300" hidden="0" layoutInCell="1" locked="0" relativeHeight="0" simplePos="0">
-              <wp:simplePos x="0" y="0"/>
-              <wp:positionH relativeFrom="column">
-                <wp:posOffset>-50799</wp:posOffset>
-              </wp:positionH>
-              <wp:positionV relativeFrom="paragraph">
-                <wp:posOffset>88900</wp:posOffset>
-              </wp:positionV>
-              <wp:extent cx="6067425" cy="31750"/>
-              <wp:effectExtent b="0" l="0" r="0" t="0"/>
-              <wp:wrapNone/>
-              <wp:docPr id="1952685492" name="image4.png"/>
-              <a:graphic>
-                <a:graphicData uri="http://schemas.openxmlformats.org/drawingml/2006/picture">
-                  <pic:pic>
-                    <pic:nvPicPr>
-                      <pic:cNvPr id="0" name="image4.png"/>
-                      <pic:cNvPicPr preferRelativeResize="0"/>
-                    </pic:nvPicPr>
-                    <pic:blipFill>
-                      <a:blip r:embed="rId1"/>
-                      <a:srcRect/>
-                      <a:stretch>
-                        <a:fillRect/>
-                      </a:stretch>
-                    </pic:blipFill>
-                    <pic:spPr>
-                      <a:xfrm>
-                        <a:off x="0" y="0"/>
-                        <a:ext cx="6067425" cy="31750"/>
-                      </a:xfrm>
-                      <a:prstGeom prst="rect"/>
-                      <a:ln/>
-                    </pic:spPr>
-                  </pic:pic>
-                </a:graphicData>
-              </a:graphic>
-            </wp:anchor>
-          </w:drawing>
-        </mc:Fallback>
-      </mc:AlternateContent>
+      <mc:AlternateContent/>
     </w:r>
   </w:p>
 </w:hdr>

</xml_diff>